<commit_message>
fix for email based signature
</commit_message>
<xml_diff>
--- a/BaronieSignatures/Templates/Switzerland/Baronie Switzerland - Mobile Included.docx
+++ b/BaronieSignatures/Templates/Switzerland/Baronie Switzerland - Mobile Included.docx
@@ -20,6 +20,7 @@
           <w:lang w:val="en-US"/>
         </w:rPr>
       </w:pPr>
+      <w:proofErr w:type="spellStart"/>
       <w:r>
         <w:rPr>
           <w:rFonts w:eastAsia="Times New Roman" w:cstheme="minorHAnsi"/>
@@ -30,6 +31,7 @@
         </w:rPr>
         <w:t>FirstLastName</w:t>
       </w:r>
+      <w:proofErr w:type="spellEnd"/>
       <w:r>
         <w:rPr>
           <w:rFonts w:eastAsia="Times New Roman" w:cstheme="minorHAnsi"/>
@@ -136,10 +138,6 @@
     <w:p>
       <w:pPr>
         <w:spacing w:after="0" w:line="315" w:lineRule="atLeast"/>
-        <w:rPr>
-          <w:rFonts w:eastAsia="Times New Roman" w:cstheme="minorHAnsi"/>
-          <w:color w:val="000000" w:themeColor="text1"/>
-        </w:rPr>
       </w:pPr>
       <w:r>
         <w:rPr>
@@ -147,14 +145,27 @@
           <w:rFonts w:cstheme="minorHAnsi"/>
           <w:color w:val="000000" w:themeColor="text1"/>
           <w:u w:val="none"/>
-          <w:lang w:val="en-US"/>
-        </w:rPr>
-        <w:t>M mobilenr</w:t>
+          <w:lang w:val="it-IT"/>
+        </w:rPr>
+        <w:t xml:space="preserve">M </w:t>
       </w:r>
+      <w:proofErr w:type="spellStart"/>
+      <w:r>
+        <w:rPr>
+          <w:rStyle w:val="Hyperlink"/>
+          <w:rFonts w:cstheme="minorHAnsi"/>
+          <w:color w:val="000000" w:themeColor="text1"/>
+          <w:u w:val="none"/>
+          <w:lang w:val="it-IT"/>
+        </w:rPr>
+        <w:t>mobilenr</w:t>
+      </w:r>
+      <w:proofErr w:type="spellEnd"/>
       <w:r>
         <w:rPr>
           <w:rFonts w:eastAsia="Times New Roman" w:cstheme="minorHAnsi"/>
           <w:color w:val="000000" w:themeColor="text1"/>
+          <w:lang w:val="it-IT"/>
         </w:rPr>
         <w:br/>
       </w:r>
@@ -163,10 +174,62 @@
           <w:rPr>
             <w:rFonts w:eastAsia="Times New Roman" w:cstheme="minorHAnsi"/>
             <w:color w:val="000000" w:themeColor="text1"/>
+            <w:lang w:val="it-IT"/>
           </w:rPr>
-          <w:t>Baronie Switzerland SA • Via Rompada 36 • 6987 Caslano • SWITZERLAND</w:t>
+          <w:t>COMOD TRADING SA</w:t>
+        </w:r>
+        <w:r>
+          <w:rPr>
+            <w:rFonts w:eastAsia="Times New Roman" w:cstheme="minorHAnsi"/>
+            <w:color w:val="000000" w:themeColor="text1"/>
+            <w:lang w:val="it-IT"/>
+          </w:rPr>
+          <w:t xml:space="preserve"> • Via </w:t>
+        </w:r>
+        <w:proofErr w:type="spellStart"/>
+        <w:r>
+          <w:rPr>
+            <w:rFonts w:eastAsia="Times New Roman" w:cstheme="minorHAnsi"/>
+            <w:color w:val="000000" w:themeColor="text1"/>
+            <w:lang w:val="it-IT"/>
+          </w:rPr>
+          <w:t>Rompada</w:t>
+        </w:r>
+        <w:proofErr w:type="spellEnd"/>
+        <w:r>
+          <w:rPr>
+            <w:rFonts w:eastAsia="Times New Roman" w:cstheme="minorHAnsi"/>
+            <w:color w:val="000000" w:themeColor="text1"/>
+            <w:lang w:val="it-IT"/>
+          </w:rPr>
+          <w:t xml:space="preserve"> 36 • 6987 Caslano • SWITZERLAND</w:t>
         </w:r>
       </w:hyperlink>
+    </w:p>
+    <w:p>
+      <w:pPr>
+        <w:spacing w:after="0" w:line="315" w:lineRule="atLeast"/>
+        <w:rPr>
+          <w:rFonts w:eastAsia="Times New Roman" w:cstheme="minorHAnsi"/>
+          <w:color w:val="FF0000"/>
+          <w:lang w:val="en-US"/>
+        </w:rPr>
+      </w:pPr>
+      <w:r>
+        <w:rPr>
+          <w:color w:val="FF0000"/>
+          <w:lang w:val="en-US"/>
+        </w:rPr>
+        <w:t>Baronie Switzerland and COMOD TRADING SA have merged into a single company.</w:t>
+      </w:r>
+      <w:r>
+        <w:rPr>
+          <w:color w:val="FF0000"/>
+          <w:lang w:val="en-US"/>
+        </w:rPr>
+        <w:br/>
+        <w:t>We kindly ask suppliers to update records, documentation and invoicing details accordingly.</w:t>
+      </w:r>
     </w:p>
     <w:tbl>
       <w:tblPr>

</xml_diff>